<commit_message>
Jaime's metrics added, but need to add the paragraph
</commit_message>
<xml_diff>
--- a/docs/SUMMARY.docx
+++ b/docs/SUMMARY.docx
@@ -810,6 +810,13 @@
                 <w:sz w:val="16"/>
               </w:rPr>
             </w:pPr>
+            <w:r>
+              <w:rPr>
+                <w:rFonts w:ascii="Calibri" w:hAnsi="Calibri"/>
+                <w:sz w:val="16"/>
+              </w:rPr>
+              <w:t>0.829 / 0.853 / 0.841</w:t>
+            </w:r>
           </w:p>
         </w:tc>
         <w:tc>
@@ -827,6 +834,13 @@
                 <w:sz w:val="16"/>
               </w:rPr>
             </w:pPr>
+            <w:r>
+              <w:rPr>
+                <w:rFonts w:ascii="Calibri" w:hAnsi="Calibri"/>
+                <w:sz w:val="16"/>
+              </w:rPr>
+              <w:t>0.674</w:t>
+            </w:r>
           </w:p>
         </w:tc>
         <w:tc>
@@ -844,6 +858,13 @@
                 <w:sz w:val="16"/>
               </w:rPr>
             </w:pPr>
+            <w:r>
+              <w:rPr>
+                <w:rFonts w:ascii="Calibri" w:hAnsi="Calibri"/>
+                <w:sz w:val="16"/>
+              </w:rPr>
+              <w:t>19.6</w:t>
+            </w:r>
           </w:p>
         </w:tc>
         <w:tc>
@@ -861,6 +882,13 @@
                 <w:sz w:val="16"/>
               </w:rPr>
             </w:pPr>
+            <w:r>
+              <w:rPr>
+                <w:rFonts w:ascii="Calibri" w:hAnsi="Calibri"/>
+                <w:sz w:val="16"/>
+              </w:rPr>
+              <w:t>24.1</w:t>
+            </w:r>
           </w:p>
         </w:tc>
         <w:tc>
@@ -878,6 +906,37 @@
                 <w:sz w:val="16"/>
               </w:rPr>
             </w:pPr>
+            <w:r>
+              <w:rPr>
+                <w:rFonts w:ascii="Calibri" w:hAnsi="Calibri"/>
+                <w:sz w:val="16"/>
+              </w:rPr>
+              <w:t>~</w:t>
+            </w:r>
+            <w:r>
+              <w:rPr>
+                <w:rFonts w:ascii="Calibri" w:hAnsi="Calibri"/>
+                <w:sz w:val="16"/>
+              </w:rPr>
+              <w:t xml:space="preserve"> 3.5 s</w:t>
+            </w:r>
+          </w:p>
+          <w:p>
+            <w:pPr>
+              <w:jc w:val="center"/>
+              <w:cnfStyle w:val="000000010000" w:firstRow="0" w:lastRow="0" w:firstColumn="0" w:lastColumn="0" w:oddVBand="0" w:evenVBand="0" w:oddHBand="0" w:evenHBand="1" w:firstRowFirstColumn="0" w:firstRowLastColumn="0" w:lastRowFirstColumn="0" w:lastRowLastColumn="0"/>
+              <w:rPr>
+                <w:rFonts w:ascii="Calibri" w:hAnsi="Calibri"/>
+                <w:sz w:val="16"/>
+              </w:rPr>
+            </w:pPr>
+            <w:r>
+              <w:rPr>
+                <w:rFonts w:ascii="Calibri" w:hAnsi="Calibri"/>
+                <w:sz w:val="16"/>
+              </w:rPr>
+              <w:t>(GPU)</w:t>
+            </w:r>
           </w:p>
         </w:tc>
       </w:tr>
@@ -1323,14 +1382,7 @@
                 <w:rFonts w:ascii="Calibri" w:hAnsi="Calibri"/>
                 <w:sz w:val="16"/>
               </w:rPr>
-              <w:t>~</w:t>
-            </w:r>
-            <w:r>
-              <w:rPr>
-                <w:rFonts w:ascii="Calibri" w:hAnsi="Calibri"/>
-                <w:sz w:val="16"/>
-              </w:rPr>
-              <w:t xml:space="preserve"> 1.5 s</w:t>
+              <w:t>~ 1.5 s</w:t>
             </w:r>
           </w:p>
           <w:p>
@@ -1605,6 +1657,13 @@
                 <w:sz w:val="16"/>
               </w:rPr>
             </w:pPr>
+            <w:r>
+              <w:rPr>
+                <w:rFonts w:ascii="Calibri" w:hAnsi="Calibri"/>
+                <w:sz w:val="16"/>
+              </w:rPr>
+              <w:t>0.984 / 0.984 / 0.984</w:t>
+            </w:r>
           </w:p>
         </w:tc>
         <w:tc>
@@ -1622,6 +1681,13 @@
                 <w:sz w:val="16"/>
               </w:rPr>
             </w:pPr>
+            <w:r>
+              <w:rPr>
+                <w:rFonts w:ascii="Calibri" w:hAnsi="Calibri"/>
+                <w:sz w:val="16"/>
+              </w:rPr>
+              <w:t>0.865</w:t>
+            </w:r>
           </w:p>
         </w:tc>
       </w:tr>
@@ -1800,22 +1866,6 @@
           <w:lang w:val="es-ES"/>
         </w:rPr>
         <w:t>Recomendación</w:t>
-      </w:r>
-      <w:r>
-        <w:rPr>
-          <w:rFonts w:ascii="Calibri" w:hAnsi="Calibri"/>
-          <w:b/>
-          <w:lang w:val="es-ES"/>
-        </w:rPr>
-        <w:t xml:space="preserve"> (</w:t>
-      </w:r>
-      <w:r>
-        <w:rPr>
-          <w:rFonts w:ascii="Calibri" w:hAnsi="Calibri"/>
-          <w:b/>
-          <w:lang w:val="es-ES"/>
-        </w:rPr>
-        <w:t>AÑADIRLO EL MARTES</w:t>
       </w:r>
     </w:p>
     <w:sectPr>

</xml_diff>

<commit_message>
README.TXT and SUMMARY of the proyect done
</commit_message>
<xml_diff>
--- a/docs/SUMMARY.docx
+++ b/docs/SUMMARY.docx
@@ -16,7 +16,7 @@
           <w:sz w:val="28"/>
           <w:lang w:val="es-ES"/>
         </w:rPr>
-        <w:t>Reto Michelin 2 — Resumen de resultados (Bloque 2)</w:t>
+        <w:t>Resumen de resultados</w:t>
       </w:r>
     </w:p>
     <w:p>
@@ -39,53 +39,22 @@
     <w:p>
       <w:pPr>
         <w:rPr>
+          <w:rFonts w:ascii="Cambria Math" w:hAnsi="Cambria Math"/>
           <w:lang w:val="es-ES"/>
         </w:rPr>
       </w:pPr>
       <w:r>
         <w:rPr>
-          <w:rFonts w:ascii="Calibri" w:hAnsi="Calibri"/>
+          <w:rFonts w:ascii="Cambria Math" w:hAnsi="Cambria Math"/>
           <w:sz w:val="20"/>
           <w:lang w:val="es-ES"/>
         </w:rPr>
-        <w:t>H</w:t>
-      </w:r>
-      <w:r>
-        <w:rPr>
-          <w:rFonts w:ascii="Calibri" w:hAnsi="Calibri"/>
-          <w:sz w:val="20"/>
-          <w:lang w:val="es-ES"/>
-        </w:rPr>
-        <w:t>emos realizado c</w:t>
-      </w:r>
-      <w:r>
-        <w:rPr>
-          <w:rFonts w:ascii="Calibri" w:hAnsi="Calibri"/>
-          <w:sz w:val="20"/>
-          <w:lang w:val="es-ES"/>
-        </w:rPr>
-        <w:t>uatro pipelines</w:t>
-      </w:r>
-      <w:r>
-        <w:rPr>
-          <w:rFonts w:ascii="Calibri" w:hAnsi="Calibri"/>
-          <w:sz w:val="20"/>
-          <w:lang w:val="es-ES"/>
-        </w:rPr>
-        <w:t xml:space="preserve">, </w:t>
-      </w:r>
-      <w:r>
-        <w:rPr>
-          <w:rFonts w:ascii="Calibri" w:hAnsi="Calibri"/>
-          <w:sz w:val="20"/>
-          <w:lang w:val="es-ES"/>
-        </w:rPr>
-        <w:t xml:space="preserve">dos </w:t>
+        <w:t xml:space="preserve">Hemos realizado cuatro pipelines, dos </w:t>
       </w:r>
       <w:proofErr w:type="spellStart"/>
       <w:r>
         <w:rPr>
-          <w:rFonts w:ascii="Calibri" w:hAnsi="Calibri"/>
+          <w:rFonts w:ascii="Cambria Math" w:hAnsi="Cambria Math"/>
           <w:i/>
           <w:iCs/>
           <w:sz w:val="20"/>
@@ -96,7 +65,7 @@
       <w:proofErr w:type="spellEnd"/>
       <w:r>
         <w:rPr>
-          <w:rFonts w:ascii="Calibri" w:hAnsi="Calibri"/>
+          <w:rFonts w:ascii="Cambria Math" w:hAnsi="Cambria Math"/>
           <w:i/>
           <w:iCs/>
           <w:sz w:val="20"/>
@@ -107,7 +76,7 @@
       <w:proofErr w:type="spellStart"/>
       <w:r>
         <w:rPr>
-          <w:rFonts w:ascii="Calibri" w:hAnsi="Calibri"/>
+          <w:rFonts w:ascii="Cambria Math" w:hAnsi="Cambria Math"/>
           <w:i/>
           <w:iCs/>
           <w:sz w:val="20"/>
@@ -118,56 +87,16 @@
       <w:proofErr w:type="spellEnd"/>
       <w:r>
         <w:rPr>
-          <w:rFonts w:ascii="Calibri" w:hAnsi="Calibri"/>
+          <w:rFonts w:ascii="Cambria Math" w:hAnsi="Cambria Math"/>
           <w:sz w:val="20"/>
           <w:lang w:val="es-ES"/>
         </w:rPr>
-        <w:t xml:space="preserve"> y dos clásicos</w:t>
-      </w:r>
-      <w:r>
-        <w:rPr>
-          <w:rFonts w:ascii="Calibri" w:hAnsi="Calibri"/>
-          <w:sz w:val="20"/>
-          <w:lang w:val="es-ES"/>
-        </w:rPr>
-        <w:t xml:space="preserve">, los cuales fueron </w:t>
-      </w:r>
-      <w:r>
-        <w:rPr>
-          <w:rFonts w:ascii="Calibri" w:hAnsi="Calibri"/>
-          <w:sz w:val="20"/>
-          <w:lang w:val="es-ES"/>
-        </w:rPr>
-        <w:t xml:space="preserve">evaluados sobre las mismas 22 imágenes del puesto de </w:t>
-      </w:r>
-      <w:r>
-        <w:rPr>
-          <w:rFonts w:ascii="Calibri" w:hAnsi="Calibri"/>
-          <w:sz w:val="20"/>
-          <w:lang w:val="es-ES"/>
-        </w:rPr>
-        <w:t>la fábrica</w:t>
-      </w:r>
-      <w:r>
-        <w:rPr>
-          <w:rFonts w:ascii="Calibri" w:hAnsi="Calibri"/>
-          <w:sz w:val="20"/>
-          <w:lang w:val="es-ES"/>
-        </w:rPr>
-        <w:t xml:space="preserve"> de Michelin Aranda y anotaciones COCO </w:t>
-      </w:r>
-      <w:r>
-        <w:rPr>
-          <w:rFonts w:ascii="Calibri" w:hAnsi="Calibri"/>
-          <w:sz w:val="20"/>
-          <w:lang w:val="es-ES"/>
-        </w:rPr>
-        <w:t xml:space="preserve">como </w:t>
+        <w:t xml:space="preserve"> y dos clásicos, los cuales fueron evaluados sobre las mismas 22 imágenes del puesto de la fábrica de Michelin Aranda y anotaciones COCO como </w:t>
       </w:r>
       <w:proofErr w:type="spellStart"/>
       <w:r>
         <w:rPr>
-          <w:rFonts w:ascii="Calibri" w:hAnsi="Calibri"/>
+          <w:rFonts w:ascii="Cambria Math" w:hAnsi="Cambria Math"/>
           <w:i/>
           <w:iCs/>
           <w:sz w:val="20"/>
@@ -178,7 +107,7 @@
       <w:proofErr w:type="spellEnd"/>
       <w:r>
         <w:rPr>
-          <w:rFonts w:ascii="Calibri" w:hAnsi="Calibri"/>
+          <w:rFonts w:ascii="Cambria Math" w:hAnsi="Cambria Math"/>
           <w:i/>
           <w:iCs/>
           <w:sz w:val="20"/>
@@ -189,7 +118,7 @@
       <w:proofErr w:type="spellStart"/>
       <w:r>
         <w:rPr>
-          <w:rFonts w:ascii="Calibri" w:hAnsi="Calibri"/>
+          <w:rFonts w:ascii="Cambria Math" w:hAnsi="Cambria Math"/>
           <w:i/>
           <w:iCs/>
           <w:sz w:val="20"/>
@@ -200,7 +129,7 @@
       <w:proofErr w:type="spellEnd"/>
       <w:r>
         <w:rPr>
-          <w:rFonts w:ascii="Calibri" w:hAnsi="Calibri"/>
+          <w:rFonts w:ascii="Cambria Math" w:hAnsi="Cambria Math"/>
           <w:sz w:val="20"/>
           <w:lang w:val="es-ES"/>
         </w:rPr>
@@ -209,7 +138,7 @@
       <w:proofErr w:type="spellStart"/>
       <w:r>
         <w:rPr>
-          <w:rFonts w:ascii="Calibri" w:hAnsi="Calibri"/>
+          <w:rFonts w:ascii="Cambria Math" w:hAnsi="Cambria Math"/>
           <w:b/>
           <w:bCs/>
           <w:sz w:val="20"/>
@@ -220,7 +149,7 @@
       <w:proofErr w:type="spellEnd"/>
       <w:r>
         <w:rPr>
-          <w:rFonts w:ascii="Calibri" w:hAnsi="Calibri"/>
+          <w:rFonts w:ascii="Cambria Math" w:hAnsi="Cambria Math"/>
           <w:sz w:val="20"/>
           <w:lang w:val="es-ES"/>
         </w:rPr>
@@ -229,7 +158,7 @@
       <w:proofErr w:type="spellStart"/>
       <w:r>
         <w:rPr>
-          <w:rFonts w:ascii="Calibri" w:hAnsi="Calibri"/>
+          <w:rFonts w:ascii="Cambria Math" w:hAnsi="Cambria Math"/>
           <w:i/>
           <w:iCs/>
           <w:sz w:val="20"/>
@@ -240,7 +169,7 @@
       <w:proofErr w:type="spellEnd"/>
       <w:r>
         <w:rPr>
-          <w:rFonts w:ascii="Calibri" w:hAnsi="Calibri"/>
+          <w:rFonts w:ascii="Cambria Math" w:hAnsi="Cambria Math"/>
           <w:i/>
           <w:iCs/>
           <w:sz w:val="20"/>
@@ -251,7 +180,7 @@
       <w:proofErr w:type="spellStart"/>
       <w:r>
         <w:rPr>
-          <w:rFonts w:ascii="Calibri" w:hAnsi="Calibri"/>
+          <w:rFonts w:ascii="Cambria Math" w:hAnsi="Cambria Math"/>
           <w:i/>
           <w:iCs/>
           <w:sz w:val="20"/>
@@ -262,27 +191,11 @@
       <w:proofErr w:type="spellEnd"/>
       <w:r>
         <w:rPr>
-          <w:rFonts w:ascii="Calibri" w:hAnsi="Calibri"/>
+          <w:rFonts w:ascii="Cambria Math" w:hAnsi="Cambria Math"/>
           <w:sz w:val="20"/>
           <w:lang w:val="es-ES"/>
         </w:rPr>
-        <w:t>) y la detección d</w:t>
-      </w:r>
-      <w:r>
-        <w:rPr>
-          <w:rFonts w:ascii="Calibri" w:hAnsi="Calibri"/>
-          <w:sz w:val="20"/>
-          <w:lang w:val="es-ES"/>
-        </w:rPr>
-        <w:t>e los</w:t>
-      </w:r>
-      <w:r>
-        <w:rPr>
-          <w:rFonts w:ascii="Calibri" w:hAnsi="Calibri"/>
-          <w:sz w:val="20"/>
-          <w:lang w:val="es-ES"/>
-        </w:rPr>
-        <w:t xml:space="preserve"> QR usados para la calibración métrica.</w:t>
+        <w:t>) y la detección de los QR usados para la calibración métrica.</w:t>
       </w:r>
     </w:p>
     <w:p>
@@ -348,13 +261,13 @@
         <w:tblLook w:val="04A0" w:firstRow="1" w:lastRow="0" w:firstColumn="1" w:lastColumn="0" w:noHBand="0" w:noVBand="1"/>
       </w:tblPr>
       <w:tblGrid>
-        <w:gridCol w:w="1538"/>
-        <w:gridCol w:w="1538"/>
-        <w:gridCol w:w="1538"/>
-        <w:gridCol w:w="1538"/>
-        <w:gridCol w:w="1538"/>
-        <w:gridCol w:w="1538"/>
-        <w:gridCol w:w="1538"/>
+        <w:gridCol w:w="1351"/>
+        <w:gridCol w:w="1440"/>
+        <w:gridCol w:w="1168"/>
+        <w:gridCol w:w="1199"/>
+        <w:gridCol w:w="1166"/>
+        <w:gridCol w:w="1175"/>
+        <w:gridCol w:w="1221"/>
       </w:tblGrid>
       <w:tr>
         <w:trPr>
@@ -1847,8 +1760,7 @@
       <w:pPr>
         <w:rPr>
           <w:rFonts w:ascii="Calibri" w:hAnsi="Calibri"/>
-          <w:i/>
-          <w:sz w:val="15"/>
+          <w:b/>
           <w:lang w:val="es-ES"/>
         </w:rPr>
       </w:pPr>
@@ -1868,10 +1780,807 @@
         <w:t>Recomendación</w:t>
       </w:r>
     </w:p>
+    <w:p>
+      <w:pPr>
+        <w:rPr>
+          <w:rFonts w:ascii="Cambria Math" w:hAnsi="Cambria Math" w:cstheme="majorHAnsi"/>
+          <w:sz w:val="20"/>
+          <w:szCs w:val="20"/>
+          <w:lang w:val="es-ES"/>
+        </w:rPr>
+      </w:pPr>
+      <w:r>
+        <w:rPr>
+          <w:rFonts w:ascii="Cambria Math" w:hAnsi="Cambria Math" w:cstheme="majorHAnsi"/>
+          <w:sz w:val="20"/>
+          <w:szCs w:val="20"/>
+          <w:lang w:val="es-ES"/>
+        </w:rPr>
+        <w:t xml:space="preserve">Por rendimiento global de métricas en la detección de bordes de corte, el pipeline recomendado es </w:t>
+      </w:r>
+      <w:proofErr w:type="spellStart"/>
+      <w:r>
+        <w:rPr>
+          <w:rFonts w:ascii="Cambria Math" w:hAnsi="Cambria Math" w:cstheme="majorHAnsi"/>
+          <w:b/>
+          <w:sz w:val="20"/>
+          <w:szCs w:val="20"/>
+          <w:lang w:val="es-ES"/>
+        </w:rPr>
+        <w:t>Grounded</w:t>
+      </w:r>
+      <w:proofErr w:type="spellEnd"/>
+      <w:r>
+        <w:rPr>
+          <w:rFonts w:ascii="Cambria Math" w:hAnsi="Cambria Math" w:cstheme="majorHAnsi"/>
+          <w:b/>
+          <w:sz w:val="20"/>
+          <w:szCs w:val="20"/>
+          <w:lang w:val="es-ES"/>
+        </w:rPr>
+        <w:t>-SAM</w:t>
+      </w:r>
+      <w:r>
+        <w:rPr>
+          <w:rFonts w:ascii="Cambria Math" w:hAnsi="Cambria Math" w:cstheme="majorHAnsi"/>
+          <w:sz w:val="20"/>
+          <w:szCs w:val="20"/>
+          <w:lang w:val="es-ES"/>
+        </w:rPr>
+        <w:t>, dado que</w:t>
+      </w:r>
+      <w:r>
+        <w:rPr>
+          <w:rFonts w:ascii="Cambria Math" w:hAnsi="Cambria Math" w:cstheme="majorHAnsi"/>
+          <w:sz w:val="20"/>
+          <w:szCs w:val="20"/>
+          <w:lang w:val="es-ES"/>
+        </w:rPr>
+        <w:t xml:space="preserve"> obtiene el mayor </w:t>
+      </w:r>
+      <w:proofErr w:type="gramStart"/>
+      <w:r>
+        <w:rPr>
+          <w:rFonts w:ascii="Cambria Math" w:hAnsi="Cambria Math" w:cstheme="majorHAnsi"/>
+          <w:i/>
+          <w:iCs/>
+          <w:sz w:val="20"/>
+          <w:szCs w:val="20"/>
+          <w:lang w:val="es-ES"/>
+        </w:rPr>
+        <w:t>Pixel</w:t>
+      </w:r>
+      <w:proofErr w:type="gramEnd"/>
+      <w:r>
+        <w:rPr>
+          <w:rFonts w:ascii="Cambria Math" w:hAnsi="Cambria Math" w:cstheme="majorHAnsi"/>
+          <w:i/>
+          <w:iCs/>
+          <w:sz w:val="20"/>
+          <w:szCs w:val="20"/>
+          <w:lang w:val="es-ES"/>
+        </w:rPr>
+        <w:t xml:space="preserve"> </w:t>
+      </w:r>
+      <w:proofErr w:type="spellStart"/>
+      <w:r>
+        <w:rPr>
+          <w:rFonts w:ascii="Cambria Math" w:hAnsi="Cambria Math" w:cstheme="majorHAnsi"/>
+          <w:i/>
+          <w:iCs/>
+          <w:sz w:val="20"/>
+          <w:szCs w:val="20"/>
+          <w:lang w:val="es-ES"/>
+        </w:rPr>
+        <w:t>IoU</w:t>
+      </w:r>
+      <w:proofErr w:type="spellEnd"/>
+      <w:r>
+        <w:rPr>
+          <w:rFonts w:ascii="Cambria Math" w:hAnsi="Cambria Math" w:cstheme="majorHAnsi"/>
+          <w:sz w:val="20"/>
+          <w:szCs w:val="20"/>
+          <w:lang w:val="es-ES"/>
+        </w:rPr>
+        <w:t xml:space="preserve"> (</w:t>
+      </w:r>
+      <w:r>
+        <w:rPr>
+          <w:rFonts w:ascii="Cambria Math" w:hAnsi="Cambria Math" w:cstheme="majorHAnsi"/>
+          <w:b/>
+          <w:bCs/>
+          <w:sz w:val="20"/>
+          <w:szCs w:val="20"/>
+          <w:lang w:val="es-ES"/>
+        </w:rPr>
+        <w:t>0.728</w:t>
+      </w:r>
+      <w:r>
+        <w:rPr>
+          <w:rFonts w:ascii="Cambria Math" w:hAnsi="Cambria Math" w:cstheme="majorHAnsi"/>
+          <w:sz w:val="20"/>
+          <w:szCs w:val="20"/>
+          <w:lang w:val="es-ES"/>
+        </w:rPr>
+        <w:t xml:space="preserve">), el menor </w:t>
+      </w:r>
+      <w:r>
+        <w:rPr>
+          <w:rFonts w:ascii="Cambria Math" w:hAnsi="Cambria Math" w:cstheme="majorHAnsi"/>
+          <w:i/>
+          <w:iCs/>
+          <w:sz w:val="20"/>
+          <w:szCs w:val="20"/>
+          <w:lang w:val="es-ES"/>
+        </w:rPr>
+        <w:t>MAE</w:t>
+      </w:r>
+      <w:r>
+        <w:rPr>
+          <w:rFonts w:ascii="Cambria Math" w:hAnsi="Cambria Math" w:cstheme="majorHAnsi"/>
+          <w:sz w:val="20"/>
+          <w:szCs w:val="20"/>
+          <w:lang w:val="es-ES"/>
+        </w:rPr>
+        <w:t xml:space="preserve"> (</w:t>
+      </w:r>
+      <w:r>
+        <w:rPr>
+          <w:rFonts w:ascii="Cambria Math" w:hAnsi="Cambria Math" w:cstheme="majorHAnsi"/>
+          <w:b/>
+          <w:bCs/>
+          <w:sz w:val="20"/>
+          <w:szCs w:val="20"/>
+          <w:lang w:val="es-ES"/>
+        </w:rPr>
+        <w:t>16.3 mm</w:t>
+      </w:r>
+      <w:r>
+        <w:rPr>
+          <w:rFonts w:ascii="Cambria Math" w:hAnsi="Cambria Math" w:cstheme="majorHAnsi"/>
+          <w:sz w:val="20"/>
+          <w:szCs w:val="20"/>
+          <w:lang w:val="es-ES"/>
+        </w:rPr>
+        <w:t xml:space="preserve">) y el mayor </w:t>
+      </w:r>
+      <w:r>
+        <w:rPr>
+          <w:rFonts w:ascii="Cambria Math" w:hAnsi="Cambria Math" w:cstheme="majorHAnsi"/>
+          <w:i/>
+          <w:iCs/>
+          <w:sz w:val="20"/>
+          <w:szCs w:val="20"/>
+          <w:lang w:val="es-ES"/>
+        </w:rPr>
+        <w:t>F1</w:t>
+      </w:r>
+      <w:r>
+        <w:rPr>
+          <w:rFonts w:ascii="Cambria Math" w:hAnsi="Cambria Math" w:cstheme="majorHAnsi"/>
+          <w:sz w:val="20"/>
+          <w:szCs w:val="20"/>
+          <w:lang w:val="es-ES"/>
+        </w:rPr>
+        <w:t xml:space="preserve"> de detección </w:t>
+      </w:r>
+      <w:r>
+        <w:rPr>
+          <w:rFonts w:ascii="Cambria Math" w:hAnsi="Cambria Math" w:cstheme="majorHAnsi"/>
+          <w:sz w:val="20"/>
+          <w:szCs w:val="20"/>
+          <w:lang w:val="es-ES"/>
+        </w:rPr>
+        <w:t xml:space="preserve">de bordes </w:t>
+      </w:r>
+      <w:r>
+        <w:rPr>
+          <w:rFonts w:ascii="Cambria Math" w:hAnsi="Cambria Math" w:cstheme="majorHAnsi"/>
+          <w:sz w:val="20"/>
+          <w:szCs w:val="20"/>
+          <w:lang w:val="es-ES"/>
+        </w:rPr>
+        <w:t>(</w:t>
+      </w:r>
+      <w:r>
+        <w:rPr>
+          <w:rFonts w:ascii="Cambria Math" w:hAnsi="Cambria Math" w:cstheme="majorHAnsi"/>
+          <w:b/>
+          <w:bCs/>
+          <w:sz w:val="20"/>
+          <w:szCs w:val="20"/>
+          <w:lang w:val="es-ES"/>
+        </w:rPr>
+        <w:t>0.879</w:t>
+      </w:r>
+      <w:r>
+        <w:rPr>
+          <w:rFonts w:ascii="Cambria Math" w:hAnsi="Cambria Math" w:cstheme="majorHAnsi"/>
+          <w:sz w:val="20"/>
+          <w:szCs w:val="20"/>
+          <w:lang w:val="es-ES"/>
+        </w:rPr>
+        <w:t xml:space="preserve">, empatado con el clásico de </w:t>
+      </w:r>
+      <w:proofErr w:type="spellStart"/>
+      <w:r>
+        <w:rPr>
+          <w:rFonts w:ascii="Cambria Math" w:hAnsi="Cambria Math" w:cstheme="majorHAnsi"/>
+          <w:sz w:val="20"/>
+          <w:szCs w:val="20"/>
+          <w:lang w:val="es-ES"/>
+        </w:rPr>
+        <w:t>OpenCV</w:t>
+      </w:r>
+      <w:proofErr w:type="spellEnd"/>
+      <w:r>
+        <w:rPr>
+          <w:rFonts w:ascii="Cambria Math" w:hAnsi="Cambria Math" w:cstheme="majorHAnsi"/>
+          <w:sz w:val="20"/>
+          <w:szCs w:val="20"/>
+          <w:lang w:val="es-ES"/>
+        </w:rPr>
+        <w:t xml:space="preserve"> y con escasa diferencia al de YOLO + </w:t>
+      </w:r>
+      <w:proofErr w:type="spellStart"/>
+      <w:r>
+        <w:rPr>
+          <w:rFonts w:ascii="Cambria Math" w:hAnsi="Cambria Math" w:cstheme="majorHAnsi"/>
+          <w:sz w:val="20"/>
+          <w:szCs w:val="20"/>
+          <w:lang w:val="es-ES"/>
+        </w:rPr>
+        <w:t>EfficientSAM</w:t>
+      </w:r>
+      <w:proofErr w:type="spellEnd"/>
+      <w:r>
+        <w:rPr>
+          <w:rFonts w:ascii="Cambria Math" w:hAnsi="Cambria Math" w:cstheme="majorHAnsi"/>
+          <w:sz w:val="20"/>
+          <w:szCs w:val="20"/>
+          <w:lang w:val="es-ES"/>
+        </w:rPr>
+        <w:t>), y es el único que no genera falsos positivos en las cinco imágenes sin corte gracias al</w:t>
+      </w:r>
+      <w:r>
+        <w:rPr>
+          <w:rFonts w:ascii="Cambria Math" w:hAnsi="Cambria Math" w:cstheme="majorHAnsi"/>
+          <w:sz w:val="20"/>
+          <w:szCs w:val="20"/>
+          <w:lang w:val="es-ES"/>
+        </w:rPr>
+        <w:t xml:space="preserve"> </w:t>
+      </w:r>
+      <w:proofErr w:type="spellStart"/>
+      <w:r>
+        <w:rPr>
+          <w:rFonts w:ascii="Cambria Math" w:hAnsi="Cambria Math" w:cstheme="majorHAnsi"/>
+          <w:sz w:val="20"/>
+          <w:szCs w:val="20"/>
+          <w:lang w:val="es-ES"/>
+        </w:rPr>
+        <w:t>postprocesado</w:t>
+      </w:r>
+      <w:proofErr w:type="spellEnd"/>
+      <w:r>
+        <w:rPr>
+          <w:rFonts w:ascii="Cambria Math" w:hAnsi="Cambria Math" w:cstheme="majorHAnsi"/>
+          <w:sz w:val="20"/>
+          <w:szCs w:val="20"/>
+          <w:lang w:val="es-ES"/>
+        </w:rPr>
+        <w:t xml:space="preserve"> aplicado con un</w:t>
+      </w:r>
+      <w:r>
+        <w:rPr>
+          <w:rFonts w:ascii="Cambria Math" w:hAnsi="Cambria Math" w:cstheme="majorHAnsi"/>
+          <w:sz w:val="20"/>
+          <w:szCs w:val="20"/>
+          <w:lang w:val="es-ES"/>
+        </w:rPr>
+        <w:t xml:space="preserve"> filtro de brillo incorporado. </w:t>
+      </w:r>
+    </w:p>
+    <w:p>
+      <w:pPr>
+        <w:rPr>
+          <w:rFonts w:ascii="Cambria Math" w:hAnsi="Cambria Math" w:cstheme="majorHAnsi"/>
+          <w:sz w:val="20"/>
+          <w:szCs w:val="20"/>
+          <w:lang w:val="es-ES"/>
+        </w:rPr>
+      </w:pPr>
+      <w:r>
+        <w:rPr>
+          <w:rFonts w:ascii="Cambria Math" w:hAnsi="Cambria Math" w:cstheme="majorHAnsi"/>
+          <w:sz w:val="20"/>
+          <w:szCs w:val="20"/>
+          <w:lang w:val="es-ES"/>
+        </w:rPr>
+        <w:t xml:space="preserve">No obstante, en términos de velocidad de </w:t>
+      </w:r>
+      <w:r>
+        <w:rPr>
+          <w:rFonts w:ascii="Cambria Math" w:hAnsi="Cambria Math" w:cstheme="majorHAnsi"/>
+          <w:sz w:val="20"/>
+          <w:szCs w:val="20"/>
+          <w:lang w:val="es-ES"/>
+        </w:rPr>
+        <w:t xml:space="preserve">inferencia, el método recomendado es el </w:t>
+      </w:r>
+      <w:r>
+        <w:rPr>
+          <w:rFonts w:ascii="Cambria Math" w:hAnsi="Cambria Math" w:cstheme="majorHAnsi"/>
+          <w:b/>
+          <w:sz w:val="20"/>
+          <w:szCs w:val="20"/>
+          <w:lang w:val="es-ES"/>
+        </w:rPr>
+        <w:t>Clásico Canny adaptativo</w:t>
+      </w:r>
+      <w:r>
+        <w:rPr>
+          <w:rFonts w:ascii="Cambria Math" w:hAnsi="Cambria Math" w:cstheme="majorHAnsi"/>
+          <w:bCs/>
+          <w:sz w:val="20"/>
+          <w:szCs w:val="20"/>
+          <w:lang w:val="es-ES"/>
+        </w:rPr>
+        <w:t>, ya que</w:t>
+      </w:r>
+      <w:r>
+        <w:rPr>
+          <w:rFonts w:ascii="Cambria Math" w:hAnsi="Cambria Math" w:cstheme="majorHAnsi"/>
+          <w:b/>
+          <w:sz w:val="20"/>
+          <w:szCs w:val="20"/>
+          <w:lang w:val="es-ES"/>
+        </w:rPr>
+        <w:t xml:space="preserve"> </w:t>
+      </w:r>
+      <w:r>
+        <w:rPr>
+          <w:rFonts w:ascii="Cambria Math" w:hAnsi="Cambria Math" w:cstheme="majorHAnsi"/>
+          <w:sz w:val="20"/>
+          <w:szCs w:val="20"/>
+          <w:lang w:val="es-ES"/>
+        </w:rPr>
+        <w:t>tarda</w:t>
+      </w:r>
+      <w:r>
+        <w:rPr>
+          <w:rFonts w:ascii="Cambria Math" w:hAnsi="Cambria Math" w:cstheme="majorHAnsi"/>
+          <w:sz w:val="20"/>
+          <w:szCs w:val="20"/>
+          <w:lang w:val="es-ES"/>
+        </w:rPr>
+        <w:t xml:space="preserve"> ~1.5 s/imagen en CPU y sin necesitar GPU ni </w:t>
+      </w:r>
+      <w:proofErr w:type="spellStart"/>
+      <w:r>
+        <w:rPr>
+          <w:rFonts w:ascii="Cambria Math" w:hAnsi="Cambria Math" w:cstheme="majorHAnsi"/>
+          <w:sz w:val="20"/>
+          <w:szCs w:val="20"/>
+          <w:lang w:val="es-ES"/>
+        </w:rPr>
+        <w:t>framework</w:t>
+      </w:r>
+      <w:proofErr w:type="spellEnd"/>
+      <w:r>
+        <w:rPr>
+          <w:rFonts w:ascii="Cambria Math" w:hAnsi="Cambria Math" w:cstheme="majorHAnsi"/>
+          <w:sz w:val="20"/>
+          <w:szCs w:val="20"/>
+          <w:lang w:val="es-ES"/>
+        </w:rPr>
+        <w:t xml:space="preserve"> de </w:t>
+      </w:r>
+      <w:proofErr w:type="spellStart"/>
+      <w:r>
+        <w:rPr>
+          <w:rFonts w:ascii="Cambria Math" w:hAnsi="Cambria Math" w:cstheme="majorHAnsi"/>
+          <w:sz w:val="20"/>
+          <w:szCs w:val="20"/>
+          <w:lang w:val="es-ES"/>
+        </w:rPr>
+        <w:t>deep</w:t>
+      </w:r>
+      <w:proofErr w:type="spellEnd"/>
+      <w:r>
+        <w:rPr>
+          <w:rFonts w:ascii="Cambria Math" w:hAnsi="Cambria Math" w:cstheme="majorHAnsi"/>
+          <w:sz w:val="20"/>
+          <w:szCs w:val="20"/>
+          <w:lang w:val="es-ES"/>
+        </w:rPr>
+        <w:t xml:space="preserve"> </w:t>
+      </w:r>
+      <w:proofErr w:type="spellStart"/>
+      <w:r>
+        <w:rPr>
+          <w:rFonts w:ascii="Cambria Math" w:hAnsi="Cambria Math" w:cstheme="majorHAnsi"/>
+          <w:sz w:val="20"/>
+          <w:szCs w:val="20"/>
+          <w:lang w:val="es-ES"/>
+        </w:rPr>
+        <w:t>learning</w:t>
+      </w:r>
+      <w:proofErr w:type="spellEnd"/>
+      <w:r>
+        <w:rPr>
+          <w:rFonts w:ascii="Cambria Math" w:hAnsi="Cambria Math" w:cstheme="majorHAnsi"/>
+          <w:sz w:val="20"/>
+          <w:szCs w:val="20"/>
+          <w:lang w:val="es-ES"/>
+        </w:rPr>
+        <w:t xml:space="preserve">, </w:t>
+      </w:r>
+      <w:r>
+        <w:rPr>
+          <w:rFonts w:ascii="Cambria Math" w:hAnsi="Cambria Math" w:cstheme="majorHAnsi"/>
+          <w:sz w:val="20"/>
+          <w:szCs w:val="20"/>
+          <w:lang w:val="es-ES"/>
+        </w:rPr>
+        <w:t xml:space="preserve">lo que lo hace el </w:t>
+      </w:r>
+      <w:r>
+        <w:rPr>
+          <w:rFonts w:ascii="Cambria Math" w:hAnsi="Cambria Math" w:cstheme="majorHAnsi"/>
+          <w:sz w:val="20"/>
+          <w:szCs w:val="20"/>
+          <w:lang w:val="es-ES"/>
+        </w:rPr>
+        <w:t xml:space="preserve">más adecuado para un entorno de producción con hardware estándar de fábrica. </w:t>
+      </w:r>
+    </w:p>
+    <w:p>
+      <w:pPr>
+        <w:rPr>
+          <w:rFonts w:ascii="Cambria Math" w:hAnsi="Cambria Math" w:cstheme="majorHAnsi"/>
+          <w:sz w:val="20"/>
+          <w:szCs w:val="20"/>
+          <w:lang w:val="es-ES"/>
+        </w:rPr>
+      </w:pPr>
+      <w:r>
+        <w:rPr>
+          <w:rFonts w:ascii="Cambria Math" w:hAnsi="Cambria Math" w:cstheme="majorHAnsi"/>
+          <w:sz w:val="20"/>
+          <w:szCs w:val="20"/>
+          <w:lang w:val="es-ES"/>
+        </w:rPr>
+        <w:t>Como nota adicional, en la detección de marcadores QR</w:t>
+      </w:r>
+      <w:r>
+        <w:rPr>
+          <w:rFonts w:ascii="Cambria Math" w:hAnsi="Cambria Math" w:cstheme="majorHAnsi"/>
+          <w:sz w:val="20"/>
+          <w:szCs w:val="20"/>
+          <w:lang w:val="es-ES"/>
+        </w:rPr>
+        <w:t xml:space="preserve">, </w:t>
+      </w:r>
+      <w:r>
+        <w:rPr>
+          <w:rFonts w:ascii="Cambria Math" w:hAnsi="Cambria Math" w:cstheme="majorHAnsi"/>
+          <w:sz w:val="20"/>
+          <w:szCs w:val="20"/>
+          <w:lang w:val="es-ES"/>
+        </w:rPr>
+        <w:t>imprescindibles para la calibración métrica</w:t>
+      </w:r>
+      <w:r>
+        <w:rPr>
+          <w:rFonts w:ascii="Cambria Math" w:hAnsi="Cambria Math" w:cstheme="majorHAnsi"/>
+          <w:sz w:val="20"/>
+          <w:szCs w:val="20"/>
+          <w:lang w:val="es-ES"/>
+        </w:rPr>
+        <w:t>,</w:t>
+      </w:r>
+      <w:r>
+        <w:rPr>
+          <w:rFonts w:ascii="Cambria Math" w:hAnsi="Cambria Math" w:cstheme="majorHAnsi"/>
+          <w:sz w:val="20"/>
+          <w:szCs w:val="20"/>
+          <w:lang w:val="es-ES"/>
+        </w:rPr>
+        <w:t xml:space="preserve"> el pipeline</w:t>
+      </w:r>
+      <w:r>
+        <w:rPr>
+          <w:rFonts w:ascii="Cambria Math" w:hAnsi="Cambria Math" w:cstheme="majorHAnsi"/>
+          <w:sz w:val="20"/>
+          <w:szCs w:val="20"/>
+          <w:lang w:val="es-ES"/>
+        </w:rPr>
+        <w:t xml:space="preserve"> de</w:t>
+      </w:r>
+      <w:r>
+        <w:rPr>
+          <w:rFonts w:ascii="Cambria Math" w:hAnsi="Cambria Math" w:cstheme="majorHAnsi"/>
+          <w:sz w:val="20"/>
+          <w:szCs w:val="20"/>
+          <w:lang w:val="es-ES"/>
+        </w:rPr>
+        <w:t xml:space="preserve"> </w:t>
+      </w:r>
+      <w:r>
+        <w:rPr>
+          <w:rFonts w:ascii="Cambria Math" w:hAnsi="Cambria Math" w:cstheme="majorHAnsi"/>
+          <w:b/>
+          <w:sz w:val="20"/>
+          <w:szCs w:val="20"/>
+          <w:lang w:val="es-ES"/>
+        </w:rPr>
+        <w:t xml:space="preserve">YOLOv9 + </w:t>
+      </w:r>
+      <w:proofErr w:type="spellStart"/>
+      <w:r>
+        <w:rPr>
+          <w:rFonts w:ascii="Cambria Math" w:hAnsi="Cambria Math" w:cstheme="majorHAnsi"/>
+          <w:b/>
+          <w:sz w:val="20"/>
+          <w:szCs w:val="20"/>
+          <w:lang w:val="es-ES"/>
+        </w:rPr>
+        <w:t>EfficientSAM</w:t>
+      </w:r>
+      <w:proofErr w:type="spellEnd"/>
+      <w:r>
+        <w:rPr>
+          <w:rFonts w:ascii="Cambria Math" w:hAnsi="Cambria Math" w:cstheme="majorHAnsi"/>
+          <w:b/>
+          <w:sz w:val="20"/>
+          <w:szCs w:val="20"/>
+          <w:lang w:val="es-ES"/>
+        </w:rPr>
+        <w:t xml:space="preserve"> </w:t>
+      </w:r>
+      <w:r>
+        <w:rPr>
+          <w:rFonts w:ascii="Cambria Math" w:hAnsi="Cambria Math" w:cstheme="majorHAnsi"/>
+          <w:sz w:val="20"/>
+          <w:szCs w:val="20"/>
+          <w:lang w:val="es-ES"/>
+        </w:rPr>
+        <w:t xml:space="preserve">obtiene los mejores resultados (F1 = 0.984, </w:t>
+      </w:r>
+      <w:proofErr w:type="spellStart"/>
+      <w:r>
+        <w:rPr>
+          <w:rFonts w:ascii="Cambria Math" w:hAnsi="Cambria Math" w:cstheme="majorHAnsi"/>
+          <w:sz w:val="20"/>
+          <w:szCs w:val="20"/>
+          <w:lang w:val="es-ES"/>
+        </w:rPr>
+        <w:t>IoU</w:t>
+      </w:r>
+      <w:proofErr w:type="spellEnd"/>
+      <w:r>
+        <w:rPr>
+          <w:rFonts w:ascii="Cambria Math" w:hAnsi="Cambria Math" w:cstheme="majorHAnsi"/>
+          <w:sz w:val="20"/>
+          <w:szCs w:val="20"/>
+          <w:lang w:val="es-ES"/>
+        </w:rPr>
+        <w:t> = 0.865).</w:t>
+      </w:r>
+    </w:p>
+    <w:p>
+      <w:pPr>
+        <w:rPr>
+          <w:rFonts w:ascii="Cambria Math" w:hAnsi="Cambria Math" w:cstheme="majorHAnsi"/>
+          <w:sz w:val="20"/>
+          <w:szCs w:val="20"/>
+          <w:lang w:val="es-ES"/>
+        </w:rPr>
+      </w:pPr>
+      <w:r>
+        <w:rPr>
+          <w:rFonts w:ascii="Cambria Math" w:hAnsi="Cambria Math" w:cstheme="majorHAnsi"/>
+          <w:sz w:val="20"/>
+          <w:szCs w:val="20"/>
+          <w:lang w:val="es-ES"/>
+        </w:rPr>
+        <w:t xml:space="preserve">En </w:t>
+      </w:r>
+      <w:r>
+        <w:rPr>
+          <w:rFonts w:ascii="Cambria Math" w:hAnsi="Cambria Math" w:cstheme="majorHAnsi"/>
+          <w:sz w:val="20"/>
+          <w:szCs w:val="20"/>
+          <w:lang w:val="es-ES"/>
+        </w:rPr>
+        <w:t xml:space="preserve">conclusión, en </w:t>
+      </w:r>
+      <w:r>
+        <w:rPr>
+          <w:rFonts w:ascii="Cambria Math" w:hAnsi="Cambria Math" w:cstheme="majorHAnsi"/>
+          <w:sz w:val="20"/>
+          <w:szCs w:val="20"/>
+          <w:lang w:val="es-ES"/>
+        </w:rPr>
+        <w:t xml:space="preserve">un entorno de producción donde la precisión sea crítica, </w:t>
+      </w:r>
+      <w:proofErr w:type="spellStart"/>
+      <w:r>
+        <w:rPr>
+          <w:rFonts w:ascii="Cambria Math" w:hAnsi="Cambria Math" w:cstheme="majorHAnsi"/>
+          <w:b/>
+          <w:bCs/>
+          <w:sz w:val="20"/>
+          <w:szCs w:val="20"/>
+          <w:lang w:val="es-ES"/>
+        </w:rPr>
+        <w:t>Grounded</w:t>
+      </w:r>
+      <w:proofErr w:type="spellEnd"/>
+      <w:r>
+        <w:rPr>
+          <w:rFonts w:ascii="Cambria Math" w:hAnsi="Cambria Math" w:cstheme="majorHAnsi"/>
+          <w:b/>
+          <w:bCs/>
+          <w:sz w:val="20"/>
+          <w:szCs w:val="20"/>
+          <w:lang w:val="es-ES"/>
+        </w:rPr>
+        <w:t>-SAM</w:t>
+      </w:r>
+      <w:r>
+        <w:rPr>
+          <w:rFonts w:ascii="Cambria Math" w:hAnsi="Cambria Math" w:cstheme="majorHAnsi"/>
+          <w:sz w:val="20"/>
+          <w:szCs w:val="20"/>
+          <w:lang w:val="es-ES"/>
+        </w:rPr>
+        <w:t xml:space="preserve"> es la opción recomendada</w:t>
+      </w:r>
+      <w:r>
+        <w:rPr>
+          <w:rFonts w:ascii="Cambria Math" w:hAnsi="Cambria Math" w:cstheme="majorHAnsi"/>
+          <w:sz w:val="20"/>
+          <w:szCs w:val="20"/>
+          <w:lang w:val="es-ES"/>
+        </w:rPr>
+        <w:t xml:space="preserve">; </w:t>
+      </w:r>
+      <w:r>
+        <w:rPr>
+          <w:rFonts w:ascii="Cambria Math" w:hAnsi="Cambria Math" w:cstheme="majorHAnsi"/>
+          <w:sz w:val="20"/>
+          <w:szCs w:val="20"/>
+          <w:lang w:val="es-ES"/>
+        </w:rPr>
+        <w:t xml:space="preserve">si el despliegue debe realizarse en hardware sin GPU, el </w:t>
+      </w:r>
+      <w:r>
+        <w:rPr>
+          <w:rFonts w:ascii="Cambria Math" w:hAnsi="Cambria Math" w:cstheme="majorHAnsi"/>
+          <w:sz w:val="20"/>
+          <w:szCs w:val="20"/>
+          <w:lang w:val="es-ES"/>
+        </w:rPr>
+        <w:t xml:space="preserve">método clásico </w:t>
+      </w:r>
+      <w:r>
+        <w:rPr>
+          <w:rFonts w:ascii="Cambria Math" w:hAnsi="Cambria Math" w:cstheme="majorHAnsi"/>
+          <w:b/>
+          <w:bCs/>
+          <w:sz w:val="20"/>
+          <w:szCs w:val="20"/>
+          <w:lang w:val="es-ES"/>
+        </w:rPr>
+        <w:t>Canny adaptativo</w:t>
+      </w:r>
+      <w:r>
+        <w:rPr>
+          <w:rFonts w:ascii="Cambria Math" w:hAnsi="Cambria Math" w:cstheme="majorHAnsi"/>
+          <w:sz w:val="20"/>
+          <w:szCs w:val="20"/>
+          <w:lang w:val="es-ES"/>
+        </w:rPr>
+        <w:t xml:space="preserve"> ofrece una solución ligera y suficientemente robusta.</w:t>
+      </w:r>
+      <w:r>
+        <w:rPr>
+          <w:rFonts w:ascii="Cambria Math" w:hAnsi="Cambria Math" w:cstheme="majorHAnsi"/>
+          <w:sz w:val="20"/>
+          <w:szCs w:val="20"/>
+          <w:lang w:val="es-ES"/>
+        </w:rPr>
+        <w:t xml:space="preserve"> Como posible mejora, un enfoque podría ser un híbrido con </w:t>
+      </w:r>
+      <w:r>
+        <w:rPr>
+          <w:rFonts w:ascii="Cambria Math" w:hAnsi="Cambria Math" w:cstheme="majorHAnsi"/>
+          <w:b/>
+          <w:bCs/>
+          <w:sz w:val="20"/>
+          <w:szCs w:val="20"/>
+          <w:lang w:val="es-ES"/>
+        </w:rPr>
+        <w:t xml:space="preserve">YOLOv9 + </w:t>
+      </w:r>
+      <w:proofErr w:type="spellStart"/>
+      <w:r>
+        <w:rPr>
+          <w:rFonts w:ascii="Cambria Math" w:hAnsi="Cambria Math" w:cstheme="majorHAnsi"/>
+          <w:b/>
+          <w:bCs/>
+          <w:sz w:val="20"/>
+          <w:szCs w:val="20"/>
+          <w:lang w:val="es-ES"/>
+        </w:rPr>
+        <w:t>EfficientSAM</w:t>
+      </w:r>
+      <w:proofErr w:type="spellEnd"/>
+      <w:r>
+        <w:rPr>
+          <w:rFonts w:ascii="Cambria Math" w:hAnsi="Cambria Math" w:cstheme="majorHAnsi"/>
+          <w:sz w:val="20"/>
+          <w:szCs w:val="20"/>
+          <w:lang w:val="es-ES"/>
+        </w:rPr>
+        <w:t>,</w:t>
+      </w:r>
+      <w:r>
+        <w:rPr>
+          <w:rFonts w:ascii="Cambria Math" w:hAnsi="Cambria Math" w:cstheme="majorHAnsi"/>
+          <w:b/>
+          <w:bCs/>
+          <w:sz w:val="20"/>
+          <w:szCs w:val="20"/>
+          <w:lang w:val="es-ES"/>
+        </w:rPr>
+        <w:t xml:space="preserve"> </w:t>
+      </w:r>
+      <w:r>
+        <w:rPr>
+          <w:rFonts w:ascii="Cambria Math" w:hAnsi="Cambria Math" w:cstheme="majorHAnsi"/>
+          <w:sz w:val="20"/>
+          <w:szCs w:val="20"/>
+          <w:lang w:val="es-ES"/>
+        </w:rPr>
+        <w:t xml:space="preserve">que use su detección de </w:t>
+      </w:r>
+      <w:proofErr w:type="spellStart"/>
+      <w:r>
+        <w:rPr>
+          <w:rFonts w:ascii="Cambria Math" w:hAnsi="Cambria Math" w:cstheme="majorHAnsi"/>
+          <w:sz w:val="20"/>
+          <w:szCs w:val="20"/>
+          <w:lang w:val="es-ES"/>
+        </w:rPr>
+        <w:t>QRs</w:t>
+      </w:r>
+      <w:proofErr w:type="spellEnd"/>
+      <w:r>
+        <w:rPr>
+          <w:rFonts w:ascii="Cambria Math" w:hAnsi="Cambria Math" w:cstheme="majorHAnsi"/>
+          <w:sz w:val="20"/>
+          <w:szCs w:val="20"/>
+          <w:lang w:val="es-ES"/>
+        </w:rPr>
+        <w:t xml:space="preserve"> como calibración de respaldo, para cubrir aquellos casos</w:t>
+      </w:r>
+      <w:r>
+        <w:rPr>
+          <w:rFonts w:ascii="Cambria Math" w:hAnsi="Cambria Math" w:cstheme="majorHAnsi"/>
+          <w:sz w:val="20"/>
+          <w:szCs w:val="20"/>
+          <w:lang w:val="es-ES"/>
+        </w:rPr>
+        <w:t xml:space="preserve"> en los que algún pipeline no detecta los tres marcadores.</w:t>
+      </w:r>
+    </w:p>
     <w:sectPr>
-      <w:pgSz w:w="12240" w:h="15840"/>
-      <w:pgMar w:top="567" w:right="737" w:bottom="567" w:left="737" w:header="720" w:footer="720" w:gutter="0"/>
-      <w:cols w:space="720"/>
+      <w:pgSz w:w="11906" w:h="16838"/>
+      <w:pgMar w:top="1417" w:right="1701" w:bottom="1417" w:left="1701" w:header="708" w:footer="708" w:gutter="0"/>
+      <w:cols w:space="708"/>
       <w:docGrid w:linePitch="360"/>
     </w:sectPr>
   </w:body>

</xml_diff>